<commit_message>
Fix Unit 7 assignment: match sample exactly (2 students), add all 4 required references, 340-word explanation
</commit_message>
<xml_diff>
--- a/CS1101_Programming_Fundamentals/Unit7_Dictionaries_Tuples/Assignment/Unit7_Programming_Assignment.docx
+++ b/CS1101_Programming_Fundamentals/Unit7_Dictionaries_Tuples/Assignment/Unit7_Programming_Assignment.docx
@@ -159,7 +159,7 @@
           <w:rFonts w:ascii="Times New Roman" w:hAnsi="Times New Roman"/>
           <w:sz w:val="24"/>
         </w:rPr>
-        <w:t xml:space="preserve">A teacher has a dictionary where each key is a student name and each value is a list of three courses that student is enrolled in. The teacher needs the inverse: a dictionary where each key is a course name and each value is a list of all students enrolled in that course. This requires writing a function that iterates over the original dictionary and restructures it so that each list item in the original values becomes a separate key in the inverted dictionary.</w:t>
+        <w:t xml:space="preserve">A teacher maintains a dictionary in which each key is a student identifier and each value is a list of three courses that student is enrolled in. The teacher needs the inverse structure: a dictionary where each course code is a key and its value is a list of all students enrolled in that course. This requires a function that iterates over the original dictionary and restructures it so that each individual item in the original value lists becomes a separate key in the inverted dictionary, with the original keys collected into lists as the new values.</w:t>
       </w:r>
     </w:p>
     <w:p>
@@ -262,14 +262,60 @@
           <w:rFonts w:ascii="Times New Roman" w:hAnsi="Times New Roman"/>
           <w:sz w:val="24"/>
         </w:rPr>
-        <w:t xml:space="preserve">"""</w:t>
-      </w:r>
-      <w:r>
-        <w:rPr>
-          <w:rFonts w:ascii="Times New Roman" w:hAnsi="Times New Roman"/>
-          <w:sz w:val="24"/>
-        </w:rPr>
-        <w:br/>
+        <w:t xml:space="preserve"># Create an empty dictionary to hold the inverted result</w:t>
+      </w:r>
+      <w:r>
+        <w:rPr>
+          <w:rFonts w:ascii="Times New Roman" w:hAnsi="Times New Roman"/>
+          <w:sz w:val="24"/>
+        </w:rPr>
+        <w:br/>
+      </w:r>
+      <w:r>
+        <w:rPr>
+          <w:rStyle w:val="NormalTok"/>
+          <w:rFonts w:ascii="Times New Roman" w:hAnsi="Times New Roman"/>
+          <w:sz w:val="24"/>
+        </w:rPr>
+        <w:t xml:space="preserve">    inverse </w:t>
+      </w:r>
+      <w:r>
+        <w:rPr>
+          <w:rStyle w:val="OperatorTok"/>
+          <w:rFonts w:ascii="Times New Roman" w:hAnsi="Times New Roman"/>
+          <w:sz w:val="24"/>
+        </w:rPr>
+        <w:t xml:space="preserve">=</w:t>
+      </w:r>
+      <w:r>
+        <w:rPr>
+          <w:rStyle w:val="NormalTok"/>
+          <w:rFonts w:ascii="Times New Roman" w:hAnsi="Times New Roman"/>
+          <w:sz w:val="24"/>
+        </w:rPr>
+        <w:t xml:space="preserve"> {}</w:t>
+      </w:r>
+      <w:r>
+        <w:rPr>
+          <w:rFonts w:ascii="Times New Roman" w:hAnsi="Times New Roman"/>
+          <w:sz w:val="24"/>
+        </w:rPr>
+        <w:br/>
+      </w:r>
+      <w:r>
+        <w:rPr>
+          <w:rFonts w:ascii="Times New Roman" w:hAnsi="Times New Roman"/>
+          <w:sz w:val="24"/>
+        </w:rPr>
+        <w:br/>
+      </w:r>
+      <w:r>
+        <w:rPr>
+          <w:rStyle w:val="NormalTok"/>
+          <w:rFonts w:ascii="Times New Roman" w:hAnsi="Times New Roman"/>
+          <w:sz w:val="24"/>
+        </w:rPr>
+        <w:t xml:space="preserve">    </w:t>
       </w:r>
       <w:r>
         <w:rPr>
@@ -277,14 +323,76 @@
           <w:rFonts w:ascii="Times New Roman" w:hAnsi="Times New Roman"/>
           <w:sz w:val="24"/>
         </w:rPr>
-        <w:t xml:space="preserve">    Inverts a student-&gt;courses dictionary into a course-&gt;students dictionary.</w:t>
-      </w:r>
-      <w:r>
-        <w:rPr>
-          <w:rFonts w:ascii="Times New Roman" w:hAnsi="Times New Roman"/>
-          <w:sz w:val="24"/>
-        </w:rPr>
-        <w:br/>
+        <w:t xml:space="preserve"># Outer loop: iterate over each student and their list of courses</w:t>
+      </w:r>
+      <w:r>
+        <w:rPr>
+          <w:rFonts w:ascii="Times New Roman" w:hAnsi="Times New Roman"/>
+          <w:sz w:val="24"/>
+        </w:rPr>
+        <w:br/>
+      </w:r>
+      <w:r>
+        <w:rPr>
+          <w:rStyle w:val="NormalTok"/>
+          <w:rFonts w:ascii="Times New Roman" w:hAnsi="Times New Roman"/>
+          <w:sz w:val="24"/>
+        </w:rPr>
+        <w:t xml:space="preserve">    </w:t>
+      </w:r>
+      <w:r>
+        <w:rPr>
+          <w:rStyle w:val="ControlFlowTok"/>
+          <w:rFonts w:ascii="Times New Roman" w:hAnsi="Times New Roman"/>
+          <w:sz w:val="24"/>
+        </w:rPr>
+        <w:t xml:space="preserve">for</w:t>
+      </w:r>
+      <w:r>
+        <w:rPr>
+          <w:rStyle w:val="NormalTok"/>
+          <w:rFonts w:ascii="Times New Roman" w:hAnsi="Times New Roman"/>
+          <w:sz w:val="24"/>
+        </w:rPr>
+        <w:t xml:space="preserve"> student, courses </w:t>
+      </w:r>
+      <w:r>
+        <w:rPr>
+          <w:rStyle w:val="KeywordTok"/>
+          <w:rFonts w:ascii="Times New Roman" w:hAnsi="Times New Roman"/>
+          <w:sz w:val="24"/>
+        </w:rPr>
+        <w:t xml:space="preserve">in</w:t>
+      </w:r>
+      <w:r>
+        <w:rPr>
+          <w:rStyle w:val="NormalTok"/>
+          <w:rFonts w:ascii="Times New Roman" w:hAnsi="Times New Roman"/>
+          <w:sz w:val="24"/>
+        </w:rPr>
+        <w:t xml:space="preserve"> d.items():</w:t>
+      </w:r>
+      <w:r>
+        <w:rPr>
+          <w:rFonts w:ascii="Times New Roman" w:hAnsi="Times New Roman"/>
+          <w:sz w:val="24"/>
+        </w:rPr>
+        <w:br/>
+      </w:r>
+      <w:r>
+        <w:rPr>
+          <w:rFonts w:ascii="Times New Roman" w:hAnsi="Times New Roman"/>
+          <w:sz w:val="24"/>
+        </w:rPr>
+        <w:br/>
+      </w:r>
+      <w:r>
+        <w:rPr>
+          <w:rStyle w:val="NormalTok"/>
+          <w:rFonts w:ascii="Times New Roman" w:hAnsi="Times New Roman"/>
+          <w:sz w:val="24"/>
+        </w:rPr>
+        <w:t xml:space="preserve">        </w:t>
       </w:r>
       <w:r>
         <w:rPr>
@@ -292,14 +400,139 @@
           <w:rFonts w:ascii="Times New Roman" w:hAnsi="Times New Roman"/>
           <w:sz w:val="24"/>
         </w:rPr>
-        <w:t xml:space="preserve">    Each course key maps to a list of students enrolled in that course.</w:t>
-      </w:r>
-      <w:r>
-        <w:rPr>
-          <w:rFonts w:ascii="Times New Roman" w:hAnsi="Times New Roman"/>
-          <w:sz w:val="24"/>
-        </w:rPr>
-        <w:br/>
+        <w:t xml:space="preserve"># Inner loop: treat each course as a potential key in the inverse dict</w:t>
+      </w:r>
+      <w:r>
+        <w:rPr>
+          <w:rFonts w:ascii="Times New Roman" w:hAnsi="Times New Roman"/>
+          <w:sz w:val="24"/>
+        </w:rPr>
+        <w:br/>
+      </w:r>
+      <w:r>
+        <w:rPr>
+          <w:rStyle w:val="NormalTok"/>
+          <w:rFonts w:ascii="Times New Roman" w:hAnsi="Times New Roman"/>
+          <w:sz w:val="24"/>
+        </w:rPr>
+        <w:t xml:space="preserve">        </w:t>
+      </w:r>
+      <w:r>
+        <w:rPr>
+          <w:rStyle w:val="ControlFlowTok"/>
+          <w:rFonts w:ascii="Times New Roman" w:hAnsi="Times New Roman"/>
+          <w:sz w:val="24"/>
+        </w:rPr>
+        <w:t xml:space="preserve">for</w:t>
+      </w:r>
+      <w:r>
+        <w:rPr>
+          <w:rStyle w:val="NormalTok"/>
+          <w:rFonts w:ascii="Times New Roman" w:hAnsi="Times New Roman"/>
+          <w:sz w:val="24"/>
+        </w:rPr>
+        <w:t xml:space="preserve"> course </w:t>
+      </w:r>
+      <w:r>
+        <w:rPr>
+          <w:rStyle w:val="KeywordTok"/>
+          <w:rFonts w:ascii="Times New Roman" w:hAnsi="Times New Roman"/>
+          <w:sz w:val="24"/>
+        </w:rPr>
+        <w:t xml:space="preserve">in</w:t>
+      </w:r>
+      <w:r>
+        <w:rPr>
+          <w:rStyle w:val="NormalTok"/>
+          <w:rFonts w:ascii="Times New Roman" w:hAnsi="Times New Roman"/>
+          <w:sz w:val="24"/>
+        </w:rPr>
+        <w:t xml:space="preserve"> courses:</w:t>
+      </w:r>
+      <w:r>
+        <w:rPr>
+          <w:rFonts w:ascii="Times New Roman" w:hAnsi="Times New Roman"/>
+          <w:sz w:val="24"/>
+        </w:rPr>
+        <w:br/>
+      </w:r>
+      <w:r>
+        <w:rPr>
+          <w:rFonts w:ascii="Times New Roman" w:hAnsi="Times New Roman"/>
+          <w:sz w:val="24"/>
+        </w:rPr>
+        <w:br/>
+      </w:r>
+      <w:r>
+        <w:rPr>
+          <w:rStyle w:val="NormalTok"/>
+          <w:rFonts w:ascii="Times New Roman" w:hAnsi="Times New Roman"/>
+          <w:sz w:val="24"/>
+        </w:rPr>
+        <w:t xml:space="preserve">            </w:t>
+      </w:r>
+      <w:r>
+        <w:rPr>
+          <w:rStyle w:val="ControlFlowTok"/>
+          <w:rFonts w:ascii="Times New Roman" w:hAnsi="Times New Roman"/>
+          <w:sz w:val="24"/>
+        </w:rPr>
+        <w:t xml:space="preserve">if</w:t>
+      </w:r>
+      <w:r>
+        <w:rPr>
+          <w:rStyle w:val="NormalTok"/>
+          <w:rFonts w:ascii="Times New Roman" w:hAnsi="Times New Roman"/>
+          <w:sz w:val="24"/>
+        </w:rPr>
+        <w:t xml:space="preserve"> course </w:t>
+      </w:r>
+      <w:r>
+        <w:rPr>
+          <w:rStyle w:val="KeywordTok"/>
+          <w:rFonts w:ascii="Times New Roman" w:hAnsi="Times New Roman"/>
+          <w:sz w:val="24"/>
+        </w:rPr>
+        <w:t xml:space="preserve">not</w:t>
+      </w:r>
+      <w:r>
+        <w:rPr>
+          <w:rStyle w:val="NormalTok"/>
+          <w:rFonts w:ascii="Times New Roman" w:hAnsi="Times New Roman"/>
+          <w:sz w:val="24"/>
+        </w:rPr>
+        <w:t xml:space="preserve"> </w:t>
+      </w:r>
+      <w:r>
+        <w:rPr>
+          <w:rStyle w:val="KeywordTok"/>
+          <w:rFonts w:ascii="Times New Roman" w:hAnsi="Times New Roman"/>
+          <w:sz w:val="24"/>
+        </w:rPr>
+        <w:t xml:space="preserve">in</w:t>
+      </w:r>
+      <w:r>
+        <w:rPr>
+          <w:rStyle w:val="NormalTok"/>
+          <w:rFonts w:ascii="Times New Roman" w:hAnsi="Times New Roman"/>
+          <w:sz w:val="24"/>
+        </w:rPr>
+        <w:t xml:space="preserve"> inverse:</w:t>
+      </w:r>
+      <w:r>
+        <w:rPr>
+          <w:rFonts w:ascii="Times New Roman" w:hAnsi="Times New Roman"/>
+          <w:sz w:val="24"/>
+        </w:rPr>
+        <w:br/>
+      </w:r>
+      <w:r>
+        <w:rPr>
+          <w:rStyle w:val="NormalTok"/>
+          <w:rFonts w:ascii="Times New Roman" w:hAnsi="Times New Roman"/>
+          <w:sz w:val="24"/>
+        </w:rPr>
+        <w:t xml:space="preserve">                </w:t>
       </w:r>
       <w:r>
         <w:rPr>
@@ -307,22 +540,22 @@
           <w:rFonts w:ascii="Times New Roman" w:hAnsi="Times New Roman"/>
           <w:sz w:val="24"/>
         </w:rPr>
-        <w:t xml:space="preserve">    """</w:t>
-      </w:r>
-      <w:r>
-        <w:rPr>
-          <w:rFonts w:ascii="Times New Roman" w:hAnsi="Times New Roman"/>
-          <w:sz w:val="24"/>
-        </w:rPr>
-        <w:br/>
-      </w:r>
-      <w:r>
-        <w:rPr>
-          <w:rStyle w:val="NormalTok"/>
-          <w:rFonts w:ascii="Times New Roman" w:hAnsi="Times New Roman"/>
-          <w:sz w:val="24"/>
-        </w:rPr>
-        <w:t xml:space="preserve">    inverse </w:t>
+        <w:t xml:space="preserve"># First time seeing this course: create a new list with this student</w:t>
+      </w:r>
+      <w:r>
+        <w:rPr>
+          <w:rFonts w:ascii="Times New Roman" w:hAnsi="Times New Roman"/>
+          <w:sz w:val="24"/>
+        </w:rPr>
+        <w:br/>
+      </w:r>
+      <w:r>
+        <w:rPr>
+          <w:rStyle w:val="NormalTok"/>
+          <w:rFonts w:ascii="Times New Roman" w:hAnsi="Times New Roman"/>
+          <w:sz w:val="24"/>
+        </w:rPr>
+        <w:t xml:space="preserve">                inverse[course] </w:t>
       </w:r>
       <w:r>
         <w:rPr>
@@ -338,22 +571,22 @@
           <w:rFonts w:ascii="Times New Roman" w:hAnsi="Times New Roman"/>
           <w:sz w:val="24"/>
         </w:rPr>
-        <w:t xml:space="preserve"> {}</w:t>
-      </w:r>
-      <w:r>
-        <w:rPr>
-          <w:rFonts w:ascii="Times New Roman" w:hAnsi="Times New Roman"/>
-          <w:sz w:val="24"/>
-        </w:rPr>
-        <w:br/>
-      </w:r>
-      <w:r>
-        <w:rPr>
-          <w:rStyle w:val="NormalTok"/>
-          <w:rFonts w:ascii="Times New Roman" w:hAnsi="Times New Roman"/>
-          <w:sz w:val="24"/>
-        </w:rPr>
-        <w:t xml:space="preserve">    </w:t>
+        <w:t xml:space="preserve"> [student]</w:t>
+      </w:r>
+      <w:r>
+        <w:rPr>
+          <w:rFonts w:ascii="Times New Roman" w:hAnsi="Times New Roman"/>
+          <w:sz w:val="24"/>
+        </w:rPr>
+        <w:br/>
+      </w:r>
+      <w:r>
+        <w:rPr>
+          <w:rStyle w:val="NormalTok"/>
+          <w:rFonts w:ascii="Times New Roman" w:hAnsi="Times New Roman"/>
+          <w:sz w:val="24"/>
+        </w:rPr>
+        <w:t xml:space="preserve">            </w:t>
       </w:r>
       <w:r>
         <w:rPr>
@@ -361,31 +594,30 @@
           <w:rFonts w:ascii="Times New Roman" w:hAnsi="Times New Roman"/>
           <w:sz w:val="24"/>
         </w:rPr>
-        <w:t xml:space="preserve">for</w:t>
-      </w:r>
-      <w:r>
-        <w:rPr>
-          <w:rStyle w:val="NormalTok"/>
-          <w:rFonts w:ascii="Times New Roman" w:hAnsi="Times New Roman"/>
-          <w:sz w:val="24"/>
-        </w:rPr>
-        <w:t xml:space="preserve"> student, courses </w:t>
-      </w:r>
-      <w:r>
-        <w:rPr>
-          <w:rStyle w:val="KeywordTok"/>
-          <w:rFonts w:ascii="Times New Roman" w:hAnsi="Times New Roman"/>
-          <w:sz w:val="24"/>
-        </w:rPr>
-        <w:t xml:space="preserve">in</w:t>
-      </w:r>
-      <w:r>
-        <w:rPr>
-          <w:rStyle w:val="NormalTok"/>
-          <w:rFonts w:ascii="Times New Roman" w:hAnsi="Times New Roman"/>
-          <w:sz w:val="24"/>
-        </w:rPr>
-        <w:t xml:space="preserve"> d.items():      </w:t>
+        <w:t xml:space="preserve">else</w:t>
+      </w:r>
+      <w:r>
+        <w:rPr>
+          <w:rStyle w:val="NormalTok"/>
+          <w:rFonts w:ascii="Times New Roman" w:hAnsi="Times New Roman"/>
+          <w:sz w:val="24"/>
+        </w:rPr>
+        <w:t xml:space="preserve">:</w:t>
+      </w:r>
+      <w:r>
+        <w:rPr>
+          <w:rFonts w:ascii="Times New Roman" w:hAnsi="Times New Roman"/>
+          <w:sz w:val="24"/>
+        </w:rPr>
+        <w:br/>
+      </w:r>
+      <w:r>
+        <w:rPr>
+          <w:rStyle w:val="NormalTok"/>
+          <w:rFonts w:ascii="Times New Roman" w:hAnsi="Times New Roman"/>
+          <w:sz w:val="24"/>
+        </w:rPr>
+        <w:t xml:space="preserve">                </w:t>
       </w:r>
       <w:r>
         <w:rPr>
@@ -393,218 +625,29 @@
           <w:rFonts w:ascii="Times New Roman" w:hAnsi="Times New Roman"/>
           <w:sz w:val="24"/>
         </w:rPr>
-        <w:t xml:space="preserve"># iterate over each student and their course list</w:t>
-      </w:r>
-      <w:r>
-        <w:rPr>
-          <w:rFonts w:ascii="Times New Roman" w:hAnsi="Times New Roman"/>
-          <w:sz w:val="24"/>
-        </w:rPr>
-        <w:br/>
-      </w:r>
-      <w:r>
-        <w:rPr>
-          <w:rStyle w:val="NormalTok"/>
-          <w:rFonts w:ascii="Times New Roman" w:hAnsi="Times New Roman"/>
-          <w:sz w:val="24"/>
-        </w:rPr>
-        <w:t xml:space="preserve">        </w:t>
-      </w:r>
-      <w:r>
-        <w:rPr>
-          <w:rStyle w:val="ControlFlowTok"/>
-          <w:rFonts w:ascii="Times New Roman" w:hAnsi="Times New Roman"/>
-          <w:sz w:val="24"/>
-        </w:rPr>
-        <w:t xml:space="preserve">for</w:t>
-      </w:r>
-      <w:r>
-        <w:rPr>
-          <w:rStyle w:val="NormalTok"/>
-          <w:rFonts w:ascii="Times New Roman" w:hAnsi="Times New Roman"/>
-          <w:sz w:val="24"/>
-        </w:rPr>
-        <w:t xml:space="preserve"> course </w:t>
-      </w:r>
-      <w:r>
-        <w:rPr>
-          <w:rStyle w:val="KeywordTok"/>
-          <w:rFonts w:ascii="Times New Roman" w:hAnsi="Times New Roman"/>
-          <w:sz w:val="24"/>
-        </w:rPr>
-        <w:t xml:space="preserve">in</w:t>
-      </w:r>
-      <w:r>
-        <w:rPr>
-          <w:rStyle w:val="NormalTok"/>
-          <w:rFonts w:ascii="Times New Roman" w:hAnsi="Times New Roman"/>
-          <w:sz w:val="24"/>
-        </w:rPr>
-        <w:t xml:space="preserve"> courses:              </w:t>
-      </w:r>
-      <w:r>
-        <w:rPr>
-          <w:rStyle w:val="CommentTok"/>
-          <w:rFonts w:ascii="Times New Roman" w:hAnsi="Times New Roman"/>
-          <w:sz w:val="24"/>
-        </w:rPr>
-        <w:t xml:space="preserve"># iterate over each course in the student's list</w:t>
-      </w:r>
-      <w:r>
-        <w:rPr>
-          <w:rFonts w:ascii="Times New Roman" w:hAnsi="Times New Roman"/>
-          <w:sz w:val="24"/>
-        </w:rPr>
-        <w:br/>
-      </w:r>
-      <w:r>
-        <w:rPr>
-          <w:rStyle w:val="NormalTok"/>
-          <w:rFonts w:ascii="Times New Roman" w:hAnsi="Times New Roman"/>
-          <w:sz w:val="24"/>
-        </w:rPr>
-        <w:t xml:space="preserve">            </w:t>
-      </w:r>
-      <w:r>
-        <w:rPr>
-          <w:rStyle w:val="ControlFlowTok"/>
-          <w:rFonts w:ascii="Times New Roman" w:hAnsi="Times New Roman"/>
-          <w:sz w:val="24"/>
-        </w:rPr>
-        <w:t xml:space="preserve">if</w:t>
-      </w:r>
-      <w:r>
-        <w:rPr>
-          <w:rStyle w:val="NormalTok"/>
-          <w:rFonts w:ascii="Times New Roman" w:hAnsi="Times New Roman"/>
-          <w:sz w:val="24"/>
-        </w:rPr>
-        <w:t xml:space="preserve"> course </w:t>
-      </w:r>
-      <w:r>
-        <w:rPr>
-          <w:rStyle w:val="KeywordTok"/>
-          <w:rFonts w:ascii="Times New Roman" w:hAnsi="Times New Roman"/>
-          <w:sz w:val="24"/>
-        </w:rPr>
-        <w:t xml:space="preserve">not</w:t>
-      </w:r>
-      <w:r>
-        <w:rPr>
-          <w:rStyle w:val="NormalTok"/>
-          <w:rFonts w:ascii="Times New Roman" w:hAnsi="Times New Roman"/>
-          <w:sz w:val="24"/>
-        </w:rPr>
-        <w:t xml:space="preserve"> </w:t>
-      </w:r>
-      <w:r>
-        <w:rPr>
-          <w:rStyle w:val="KeywordTok"/>
-          <w:rFonts w:ascii="Times New Roman" w:hAnsi="Times New Roman"/>
-          <w:sz w:val="24"/>
-        </w:rPr>
-        <w:t xml:space="preserve">in</w:t>
-      </w:r>
-      <w:r>
-        <w:rPr>
-          <w:rStyle w:val="NormalTok"/>
-          <w:rFonts w:ascii="Times New Roman" w:hAnsi="Times New Roman"/>
-          <w:sz w:val="24"/>
-        </w:rPr>
-        <w:t xml:space="preserve"> inverse:</w:t>
-      </w:r>
-      <w:r>
-        <w:rPr>
-          <w:rFonts w:ascii="Times New Roman" w:hAnsi="Times New Roman"/>
-          <w:sz w:val="24"/>
-        </w:rPr>
-        <w:br/>
-      </w:r>
-      <w:r>
-        <w:rPr>
-          <w:rStyle w:val="NormalTok"/>
-          <w:rFonts w:ascii="Times New Roman" w:hAnsi="Times New Roman"/>
-          <w:sz w:val="24"/>
-        </w:rPr>
-        <w:t xml:space="preserve">                inverse[course] </w:t>
-      </w:r>
-      <w:r>
-        <w:rPr>
-          <w:rStyle w:val="OperatorTok"/>
-          <w:rFonts w:ascii="Times New Roman" w:hAnsi="Times New Roman"/>
-          <w:sz w:val="24"/>
-        </w:rPr>
-        <w:t xml:space="preserve">=</w:t>
-      </w:r>
-      <w:r>
-        <w:rPr>
-          <w:rStyle w:val="NormalTok"/>
-          <w:rFonts w:ascii="Times New Roman" w:hAnsi="Times New Roman"/>
-          <w:sz w:val="24"/>
-        </w:rPr>
-        <w:t xml:space="preserve"> [student] </w:t>
-      </w:r>
-      <w:r>
-        <w:rPr>
-          <w:rStyle w:val="CommentTok"/>
-          <w:rFonts w:ascii="Times New Roman" w:hAnsi="Times New Roman"/>
-          <w:sz w:val="24"/>
-        </w:rPr>
-        <w:t xml:space="preserve"># first student for this course</w:t>
-      </w:r>
-      <w:r>
-        <w:rPr>
-          <w:rFonts w:ascii="Times New Roman" w:hAnsi="Times New Roman"/>
-          <w:sz w:val="24"/>
-        </w:rPr>
-        <w:br/>
-      </w:r>
-      <w:r>
-        <w:rPr>
-          <w:rStyle w:val="NormalTok"/>
-          <w:rFonts w:ascii="Times New Roman" w:hAnsi="Times New Roman"/>
-          <w:sz w:val="24"/>
-        </w:rPr>
-        <w:t xml:space="preserve">            </w:t>
-      </w:r>
-      <w:r>
-        <w:rPr>
-          <w:rStyle w:val="ControlFlowTok"/>
-          <w:rFonts w:ascii="Times New Roman" w:hAnsi="Times New Roman"/>
-          <w:sz w:val="24"/>
-        </w:rPr>
-        <w:t xml:space="preserve">else</w:t>
-      </w:r>
-      <w:r>
-        <w:rPr>
-          <w:rStyle w:val="NormalTok"/>
-          <w:rFonts w:ascii="Times New Roman" w:hAnsi="Times New Roman"/>
-          <w:sz w:val="24"/>
-        </w:rPr>
-        <w:t xml:space="preserve">:</w:t>
-      </w:r>
-      <w:r>
-        <w:rPr>
-          <w:rFonts w:ascii="Times New Roman" w:hAnsi="Times New Roman"/>
-          <w:sz w:val="24"/>
-        </w:rPr>
-        <w:br/>
-      </w:r>
-      <w:r>
-        <w:rPr>
-          <w:rStyle w:val="NormalTok"/>
-          <w:rFonts w:ascii="Times New Roman" w:hAnsi="Times New Roman"/>
-          <w:sz w:val="24"/>
-        </w:rPr>
-        <w:t xml:space="preserve">                inverse[course].append(student)  </w:t>
-      </w:r>
-      <w:r>
-        <w:rPr>
-          <w:rStyle w:val="CommentTok"/>
-          <w:rFonts w:ascii="Times New Roman" w:hAnsi="Times New Roman"/>
-          <w:sz w:val="24"/>
-        </w:rPr>
-        <w:t xml:space="preserve"># add to existing list</w:t>
+        <w:t xml:space="preserve"># Course already exists: append this student to the existing list</w:t>
+      </w:r>
+      <w:r>
+        <w:rPr>
+          <w:rFonts w:ascii="Times New Roman" w:hAnsi="Times New Roman"/>
+          <w:sz w:val="24"/>
+        </w:rPr>
+        <w:br/>
+      </w:r>
+      <w:r>
+        <w:rPr>
+          <w:rStyle w:val="NormalTok"/>
+          <w:rFonts w:ascii="Times New Roman" w:hAnsi="Times New Roman"/>
+          <w:sz w:val="24"/>
+        </w:rPr>
+        <w:t xml:space="preserve">                inverse[course].append(student)</w:t>
+      </w:r>
+      <w:r>
+        <w:rPr>
+          <w:rFonts w:ascii="Times New Roman" w:hAnsi="Times New Roman"/>
+          <w:sz w:val="24"/>
+        </w:rPr>
+        <w:br/>
       </w:r>
       <w:r>
         <w:rPr>
@@ -653,7 +696,7 @@
       </w:r>
     </w:p>
     <w:bookmarkEnd w:id="10"/>
-    <w:bookmarkStart w:id="11" w:name="full-program-with-output"/>
+    <w:bookmarkStart w:id="11" w:name="full-program-and-output"/>
     <w:p>
       <w:pPr>
         <w:pStyle w:val="Heading3"/>
@@ -664,7 +707,7 @@
           <w:rFonts w:ascii="Times New Roman" w:hAnsi="Times New Roman"/>
           <w:sz w:val="24"/>
         </w:rPr>
-        <w:t xml:space="preserve">Full Program with Output</w:t>
+        <w:t xml:space="preserve">Full Program and Output</w:t>
       </w:r>
     </w:p>
     <w:p>
@@ -678,7 +721,7 @@
           <w:rFonts w:ascii="Times New Roman" w:hAnsi="Times New Roman"/>
           <w:sz w:val="24"/>
         </w:rPr>
-        <w:t xml:space="preserve"># Original dictionary: student -&gt; list of 3 courses</w:t>
+        <w:t xml:space="preserve"># Original dictionary: 2 students, each enrolled in 3 courses</w:t>
       </w:r>
       <w:r>
         <w:rPr>
@@ -882,82 +925,166 @@
           <w:rFonts w:ascii="Times New Roman" w:hAnsi="Times New Roman"/>
           <w:sz w:val="24"/>
         </w:rPr>
+        <w:t xml:space="preserve">}</w:t>
+      </w:r>
+      <w:r>
+        <w:rPr>
+          <w:rFonts w:ascii="Times New Roman" w:hAnsi="Times New Roman"/>
+          <w:sz w:val="24"/>
+        </w:rPr>
+        <w:br/>
+      </w:r>
+      <w:r>
+        <w:rPr>
+          <w:rFonts w:ascii="Times New Roman" w:hAnsi="Times New Roman"/>
+          <w:sz w:val="24"/>
+        </w:rPr>
+        <w:br/>
+      </w:r>
+      <w:r>
+        <w:rPr>
+          <w:rStyle w:val="CommentTok"/>
+          <w:rFonts w:ascii="Times New Roman" w:hAnsi="Times New Roman"/>
+          <w:sz w:val="24"/>
+        </w:rPr>
+        <w:t xml:space="preserve"># Print the original dictionary</w:t>
+      </w:r>
+      <w:r>
+        <w:rPr>
+          <w:rFonts w:ascii="Times New Roman" w:hAnsi="Times New Roman"/>
+          <w:sz w:val="24"/>
+        </w:rPr>
+        <w:br/>
+      </w:r>
+      <w:r>
+        <w:rPr>
+          <w:rStyle w:val="BuiltInTok"/>
+          <w:rFonts w:ascii="Times New Roman" w:hAnsi="Times New Roman"/>
+          <w:sz w:val="24"/>
+        </w:rPr>
+        <w:t xml:space="preserve">print</w:t>
+      </w:r>
+      <w:r>
+        <w:rPr>
+          <w:rStyle w:val="NormalTok"/>
+          <w:rFonts w:ascii="Times New Roman" w:hAnsi="Times New Roman"/>
+          <w:sz w:val="24"/>
+        </w:rPr>
+        <w:t xml:space="preserve">(</w:t>
+      </w:r>
+      <w:r>
+        <w:rPr>
+          <w:rStyle w:val="StringTok"/>
+          <w:rFonts w:ascii="Times New Roman" w:hAnsi="Times New Roman"/>
+          <w:sz w:val="24"/>
+        </w:rPr>
+        <w:t xml:space="preserve">'Original dictionary:'</w:t>
+      </w:r>
+      <w:r>
+        <w:rPr>
+          <w:rStyle w:val="NormalTok"/>
+          <w:rFonts w:ascii="Times New Roman" w:hAnsi="Times New Roman"/>
+          <w:sz w:val="24"/>
+        </w:rPr>
+        <w:t xml:space="preserve">)</w:t>
+      </w:r>
+      <w:r>
+        <w:rPr>
+          <w:rFonts w:ascii="Times New Roman" w:hAnsi="Times New Roman"/>
+          <w:sz w:val="24"/>
+        </w:rPr>
+        <w:br/>
+      </w:r>
+      <w:r>
+        <w:rPr>
+          <w:rStyle w:val="ControlFlowTok"/>
+          <w:rFonts w:ascii="Times New Roman" w:hAnsi="Times New Roman"/>
+          <w:sz w:val="24"/>
+        </w:rPr>
+        <w:t xml:space="preserve">for</w:t>
+      </w:r>
+      <w:r>
+        <w:rPr>
+          <w:rStyle w:val="NormalTok"/>
+          <w:rFonts w:ascii="Times New Roman" w:hAnsi="Times New Roman"/>
+          <w:sz w:val="24"/>
+        </w:rPr>
+        <w:t xml:space="preserve"> student, courses </w:t>
+      </w:r>
+      <w:r>
+        <w:rPr>
+          <w:rStyle w:val="KeywordTok"/>
+          <w:rFonts w:ascii="Times New Roman" w:hAnsi="Times New Roman"/>
+          <w:sz w:val="24"/>
+        </w:rPr>
+        <w:t xml:space="preserve">in</w:t>
+      </w:r>
+      <w:r>
+        <w:rPr>
+          <w:rStyle w:val="NormalTok"/>
+          <w:rFonts w:ascii="Times New Roman" w:hAnsi="Times New Roman"/>
+          <w:sz w:val="24"/>
+        </w:rPr>
+        <w:t xml:space="preserve"> student_courses.items():</w:t>
+      </w:r>
+      <w:r>
+        <w:rPr>
+          <w:rFonts w:ascii="Times New Roman" w:hAnsi="Times New Roman"/>
+          <w:sz w:val="24"/>
+        </w:rPr>
+        <w:br/>
+      </w:r>
+      <w:r>
+        <w:rPr>
+          <w:rStyle w:val="NormalTok"/>
+          <w:rFonts w:ascii="Times New Roman" w:hAnsi="Times New Roman"/>
+          <w:sz w:val="24"/>
+        </w:rPr>
         <w:t xml:space="preserve">    </w:t>
       </w:r>
       <w:r>
         <w:rPr>
-          <w:rStyle w:val="StringTok"/>
-          <w:rFonts w:ascii="Times New Roman" w:hAnsi="Times New Roman"/>
-          <w:sz w:val="24"/>
-        </w:rPr>
-        <w:t xml:space="preserve">'Stud3'</w:t>
-      </w:r>
-      <w:r>
-        <w:rPr>
-          <w:rStyle w:val="NormalTok"/>
-          <w:rFonts w:ascii="Times New Roman" w:hAnsi="Times New Roman"/>
-          <w:sz w:val="24"/>
-        </w:rPr>
-        <w:t xml:space="preserve">: [</w:t>
-      </w:r>
-      <w:r>
-        <w:rPr>
-          <w:rStyle w:val="StringTok"/>
-          <w:rFonts w:ascii="Times New Roman" w:hAnsi="Times New Roman"/>
-          <w:sz w:val="24"/>
-        </w:rPr>
-        <w:t xml:space="preserve">'CS1101'</w:t>
-      </w:r>
-      <w:r>
-        <w:rPr>
-          <w:rStyle w:val="NormalTok"/>
-          <w:rFonts w:ascii="Times New Roman" w:hAnsi="Times New Roman"/>
-          <w:sz w:val="24"/>
-        </w:rPr>
-        <w:t xml:space="preserve">, </w:t>
-      </w:r>
-      <w:r>
-        <w:rPr>
-          <w:rStyle w:val="StringTok"/>
-          <w:rFonts w:ascii="Times New Roman" w:hAnsi="Times New Roman"/>
-          <w:sz w:val="24"/>
-        </w:rPr>
-        <w:t xml:space="preserve">'CS1102'</w:t>
-      </w:r>
-      <w:r>
-        <w:rPr>
-          <w:rStyle w:val="NormalTok"/>
-          <w:rFonts w:ascii="Times New Roman" w:hAnsi="Times New Roman"/>
-          <w:sz w:val="24"/>
-        </w:rPr>
-        <w:t xml:space="preserve">, </w:t>
-      </w:r>
-      <w:r>
-        <w:rPr>
-          <w:rStyle w:val="StringTok"/>
-          <w:rFonts w:ascii="Times New Roman" w:hAnsi="Times New Roman"/>
-          <w:sz w:val="24"/>
-        </w:rPr>
-        <w:t xml:space="preserve">'CS2402'</w:t>
-      </w:r>
-      <w:r>
-        <w:rPr>
-          <w:rStyle w:val="NormalTok"/>
-          <w:rFonts w:ascii="Times New Roman" w:hAnsi="Times New Roman"/>
-          <w:sz w:val="24"/>
-        </w:rPr>
-        <w:t xml:space="preserve">],</w:t>
-      </w:r>
-      <w:r>
-        <w:rPr>
-          <w:rFonts w:ascii="Times New Roman" w:hAnsi="Times New Roman"/>
-          <w:sz w:val="24"/>
-        </w:rPr>
-        <w:br/>
-      </w:r>
-      <w:r>
-        <w:rPr>
-          <w:rStyle w:val="NormalTok"/>
+          <w:rStyle w:val="BuiltInTok"/>
+          <w:rFonts w:ascii="Times New Roman" w:hAnsi="Times New Roman"/>
+          <w:sz w:val="24"/>
+        </w:rPr>
+        <w:t xml:space="preserve">print</w:t>
+      </w:r>
+      <w:r>
+        <w:rPr>
+          <w:rStyle w:val="NormalTok"/>
+          <w:rFonts w:ascii="Times New Roman" w:hAnsi="Times New Roman"/>
+          <w:sz w:val="24"/>
+        </w:rPr>
+        <w:t xml:space="preserve">(</w:t>
+      </w:r>
+      <w:r>
+        <w:rPr>
+          <w:rStyle w:val="SpecialStringTok"/>
+          <w:rFonts w:ascii="Times New Roman" w:hAnsi="Times New Roman"/>
+          <w:sz w:val="24"/>
+        </w:rPr>
+        <w:t xml:space="preserve">f'  </w:t>
+      </w:r>
+      <w:r>
+        <w:rPr>
+          <w:rStyle w:val="SpecialCharTok"/>
+          <w:rFonts w:ascii="Times New Roman" w:hAnsi="Times New Roman"/>
+          <w:sz w:val="24"/>
+        </w:rPr>
+        <w:t xml:space="preserve">{</w:t>
+      </w:r>
+      <w:r>
+        <w:rPr>
+          <w:rStyle w:val="NormalTok"/>
+          <w:rFonts w:ascii="Times New Roman" w:hAnsi="Times New Roman"/>
+          <w:sz w:val="24"/>
+        </w:rPr>
+        <w:t xml:space="preserve">student</w:t>
+      </w:r>
+      <w:r>
+        <w:rPr>
+          <w:rStyle w:val="SpecialCharTok"/>
           <w:rFonts w:ascii="Times New Roman" w:hAnsi="Times New Roman"/>
           <w:sz w:val="24"/>
         </w:rPr>
@@ -965,41 +1092,43 @@
       </w:r>
       <w:r>
         <w:rPr>
-          <w:rFonts w:ascii="Times New Roman" w:hAnsi="Times New Roman"/>
-          <w:sz w:val="24"/>
-        </w:rPr>
-        <w:br/>
-      </w:r>
-      <w:r>
-        <w:rPr>
-          <w:rFonts w:ascii="Times New Roman" w:hAnsi="Times New Roman"/>
-          <w:sz w:val="24"/>
-        </w:rPr>
-        <w:br/>
-      </w:r>
-      <w:r>
-        <w:rPr>
-          <w:rStyle w:val="BuiltInTok"/>
-          <w:rFonts w:ascii="Times New Roman" w:hAnsi="Times New Roman"/>
-          <w:sz w:val="24"/>
-        </w:rPr>
-        <w:t xml:space="preserve">print</w:t>
-      </w:r>
-      <w:r>
-        <w:rPr>
-          <w:rStyle w:val="NormalTok"/>
-          <w:rFonts w:ascii="Times New Roman" w:hAnsi="Times New Roman"/>
-          <w:sz w:val="24"/>
-        </w:rPr>
-        <w:t xml:space="preserve">(</w:t>
-      </w:r>
-      <w:r>
-        <w:rPr>
-          <w:rStyle w:val="StringTok"/>
-          <w:rFonts w:ascii="Times New Roman" w:hAnsi="Times New Roman"/>
-          <w:sz w:val="24"/>
-        </w:rPr>
-        <w:t xml:space="preserve">'Original dictionary:'</w:t>
+          <w:rStyle w:val="SpecialStringTok"/>
+          <w:rFonts w:ascii="Times New Roman" w:hAnsi="Times New Roman"/>
+          <w:sz w:val="24"/>
+        </w:rPr>
+        <w:t xml:space="preserve">: </w:t>
+      </w:r>
+      <w:r>
+        <w:rPr>
+          <w:rStyle w:val="SpecialCharTok"/>
+          <w:rFonts w:ascii="Times New Roman" w:hAnsi="Times New Roman"/>
+          <w:sz w:val="24"/>
+        </w:rPr>
+        <w:t xml:space="preserve">{</w:t>
+      </w:r>
+      <w:r>
+        <w:rPr>
+          <w:rStyle w:val="NormalTok"/>
+          <w:rFonts w:ascii="Times New Roman" w:hAnsi="Times New Roman"/>
+          <w:sz w:val="24"/>
+        </w:rPr>
+        <w:t xml:space="preserve">courses</w:t>
+      </w:r>
+      <w:r>
+        <w:rPr>
+          <w:rStyle w:val="SpecialCharTok"/>
+          <w:rFonts w:ascii="Times New Roman" w:hAnsi="Times New Roman"/>
+          <w:sz w:val="24"/>
+        </w:rPr>
+        <w:t xml:space="preserve">}</w:t>
+      </w:r>
+      <w:r>
+        <w:rPr>
+          <w:rStyle w:val="SpecialStringTok"/>
+          <w:rFonts w:ascii="Times New Roman" w:hAnsi="Times New Roman"/>
+          <w:sz w:val="24"/>
+        </w:rPr>
+        <w:t xml:space="preserve">'</w:t>
       </w:r>
       <w:r>
         <w:rPr>
@@ -1018,153 +1147,18 @@
       </w:r>
       <w:r>
         <w:rPr>
-          <w:rStyle w:val="ControlFlowTok"/>
-          <w:rFonts w:ascii="Times New Roman" w:hAnsi="Times New Roman"/>
-          <w:sz w:val="24"/>
-        </w:rPr>
-        <w:t xml:space="preserve">for</w:t>
-      </w:r>
-      <w:r>
-        <w:rPr>
-          <w:rStyle w:val="NormalTok"/>
-          <w:rFonts w:ascii="Times New Roman" w:hAnsi="Times New Roman"/>
-          <w:sz w:val="24"/>
-        </w:rPr>
-        <w:t xml:space="preserve"> student, courses </w:t>
-      </w:r>
-      <w:r>
-        <w:rPr>
-          <w:rStyle w:val="KeywordTok"/>
-          <w:rFonts w:ascii="Times New Roman" w:hAnsi="Times New Roman"/>
-          <w:sz w:val="24"/>
-        </w:rPr>
-        <w:t xml:space="preserve">in</w:t>
-      </w:r>
-      <w:r>
-        <w:rPr>
-          <w:rStyle w:val="NormalTok"/>
-          <w:rFonts w:ascii="Times New Roman" w:hAnsi="Times New Roman"/>
-          <w:sz w:val="24"/>
-        </w:rPr>
-        <w:t xml:space="preserve"> student_courses.items():</w:t>
-      </w:r>
-      <w:r>
-        <w:rPr>
-          <w:rFonts w:ascii="Times New Roman" w:hAnsi="Times New Roman"/>
-          <w:sz w:val="24"/>
-        </w:rPr>
-        <w:br/>
-      </w:r>
-      <w:r>
-        <w:rPr>
-          <w:rStyle w:val="NormalTok"/>
-          <w:rFonts w:ascii="Times New Roman" w:hAnsi="Times New Roman"/>
-          <w:sz w:val="24"/>
-        </w:rPr>
-        <w:t xml:space="preserve">    </w:t>
-      </w:r>
-      <w:r>
-        <w:rPr>
-          <w:rStyle w:val="BuiltInTok"/>
-          <w:rFonts w:ascii="Times New Roman" w:hAnsi="Times New Roman"/>
-          <w:sz w:val="24"/>
-        </w:rPr>
-        <w:t xml:space="preserve">print</w:t>
-      </w:r>
-      <w:r>
-        <w:rPr>
-          <w:rStyle w:val="NormalTok"/>
-          <w:rFonts w:ascii="Times New Roman" w:hAnsi="Times New Roman"/>
-          <w:sz w:val="24"/>
-        </w:rPr>
-        <w:t xml:space="preserve">(</w:t>
-      </w:r>
-      <w:r>
-        <w:rPr>
-          <w:rStyle w:val="SpecialStringTok"/>
-          <w:rFonts w:ascii="Times New Roman" w:hAnsi="Times New Roman"/>
-          <w:sz w:val="24"/>
-        </w:rPr>
-        <w:t xml:space="preserve">f'  </w:t>
-      </w:r>
-      <w:r>
-        <w:rPr>
-          <w:rStyle w:val="SpecialCharTok"/>
-          <w:rFonts w:ascii="Times New Roman" w:hAnsi="Times New Roman"/>
-          <w:sz w:val="24"/>
-        </w:rPr>
-        <w:t xml:space="preserve">{</w:t>
-      </w:r>
-      <w:r>
-        <w:rPr>
-          <w:rStyle w:val="NormalTok"/>
-          <w:rFonts w:ascii="Times New Roman" w:hAnsi="Times New Roman"/>
-          <w:sz w:val="24"/>
-        </w:rPr>
-        <w:t xml:space="preserve">student</w:t>
-      </w:r>
-      <w:r>
-        <w:rPr>
-          <w:rStyle w:val="SpecialCharTok"/>
-          <w:rFonts w:ascii="Times New Roman" w:hAnsi="Times New Roman"/>
-          <w:sz w:val="24"/>
-        </w:rPr>
-        <w:t xml:space="preserve">}</w:t>
-      </w:r>
-      <w:r>
-        <w:rPr>
-          <w:rStyle w:val="SpecialStringTok"/>
-          <w:rFonts w:ascii="Times New Roman" w:hAnsi="Times New Roman"/>
-          <w:sz w:val="24"/>
-        </w:rPr>
-        <w:t xml:space="preserve">: </w:t>
-      </w:r>
-      <w:r>
-        <w:rPr>
-          <w:rStyle w:val="SpecialCharTok"/>
-          <w:rFonts w:ascii="Times New Roman" w:hAnsi="Times New Roman"/>
-          <w:sz w:val="24"/>
-        </w:rPr>
-        <w:t xml:space="preserve">{</w:t>
-      </w:r>
-      <w:r>
-        <w:rPr>
-          <w:rStyle w:val="NormalTok"/>
-          <w:rFonts w:ascii="Times New Roman" w:hAnsi="Times New Roman"/>
-          <w:sz w:val="24"/>
-        </w:rPr>
-        <w:t xml:space="preserve">courses</w:t>
-      </w:r>
-      <w:r>
-        <w:rPr>
-          <w:rStyle w:val="SpecialCharTok"/>
-          <w:rFonts w:ascii="Times New Roman" w:hAnsi="Times New Roman"/>
-          <w:sz w:val="24"/>
-        </w:rPr>
-        <w:t xml:space="preserve">}</w:t>
-      </w:r>
-      <w:r>
-        <w:rPr>
-          <w:rStyle w:val="SpecialStringTok"/>
-          <w:rFonts w:ascii="Times New Roman" w:hAnsi="Times New Roman"/>
-          <w:sz w:val="24"/>
-        </w:rPr>
-        <w:t xml:space="preserve">'</w:t>
-      </w:r>
-      <w:r>
-        <w:rPr>
-          <w:rStyle w:val="NormalTok"/>
-          <w:rFonts w:ascii="Times New Roman" w:hAnsi="Times New Roman"/>
-          <w:sz w:val="24"/>
-        </w:rPr>
-        <w:t xml:space="preserve">)</w:t>
-      </w:r>
-      <w:r>
-        <w:rPr>
-          <w:rFonts w:ascii="Times New Roman" w:hAnsi="Times New Roman"/>
-          <w:sz w:val="24"/>
-        </w:rPr>
-        <w:br/>
+          <w:rFonts w:ascii="Times New Roman" w:hAnsi="Times New Roman"/>
+          <w:sz w:val="24"/>
+        </w:rPr>
+        <w:br/>
+      </w:r>
+      <w:r>
+        <w:rPr>
+          <w:rStyle w:val="CommentTok"/>
+          <w:rFonts w:ascii="Times New Roman" w:hAnsi="Times New Roman"/>
+          <w:sz w:val="24"/>
+        </w:rPr>
+        <w:t xml:space="preserve"># Call the invert function</w:t>
       </w:r>
       <w:r>
         <w:rPr>
@@ -1203,6 +1197,21 @@
           <w:sz w:val="24"/>
         </w:rPr>
         <w:br/>
+      </w:r>
+      <w:r>
+        <w:rPr>
+          <w:rFonts w:ascii="Times New Roman" w:hAnsi="Times New Roman"/>
+          <w:sz w:val="24"/>
+        </w:rPr>
+        <w:br/>
+      </w:r>
+      <w:r>
+        <w:rPr>
+          <w:rStyle w:val="CommentTok"/>
+          <w:rFonts w:ascii="Times New Roman" w:hAnsi="Times New Roman"/>
+          <w:sz w:val="24"/>
+        </w:rPr>
+        <w:t xml:space="preserve"># Print the inverted dictionary</w:t>
       </w:r>
       <w:r>
         <w:rPr>
@@ -1491,18 +1500,18 @@
       </w:r>
       <w:r>
         <w:rPr>
+          <w:rFonts w:ascii="Times New Roman" w:hAnsi="Times New Roman"/>
+          <w:sz w:val="24"/>
+        </w:rPr>
+        <w:br/>
+      </w:r>
+      <w:r>
+        <w:rPr>
           <w:rStyle w:val="VerbatimChar"/>
           <w:rFonts w:ascii="Times New Roman" w:hAnsi="Times New Roman"/>
           <w:sz w:val="24"/>
         </w:rPr>
-        <w:t xml:space="preserve">  Stud3: ['CS1101', 'CS1102', 'CS2402']</w:t>
-      </w:r>
-      <w:r>
-        <w:rPr>
-          <w:rFonts w:ascii="Times New Roman" w:hAnsi="Times New Roman"/>
-          <w:sz w:val="24"/>
-        </w:rPr>
-        <w:br/>
+        <w:t xml:space="preserve">Inverted dictionary:</w:t>
       </w:r>
       <w:r>
         <w:rPr>
@@ -1517,7 +1526,7 @@
           <w:rFonts w:ascii="Times New Roman" w:hAnsi="Times New Roman"/>
           <w:sz w:val="24"/>
         </w:rPr>
-        <w:t xml:space="preserve">Inverted dictionary:</w:t>
+        <w:t xml:space="preserve">  CS1101: ['Stud1']</w:t>
       </w:r>
       <w:r>
         <w:rPr>
@@ -1532,7 +1541,7 @@
           <w:rFonts w:ascii="Times New Roman" w:hAnsi="Times New Roman"/>
           <w:sz w:val="24"/>
         </w:rPr>
-        <w:t xml:space="preserve">  CS1101: ['Stud1', 'Stud3']</w:t>
+        <w:t xml:space="preserve">  CS2402: ['Stud1', 'Stud2']</w:t>
       </w:r>
       <w:r>
         <w:rPr>
@@ -1547,7 +1556,7 @@
           <w:rFonts w:ascii="Times New Roman" w:hAnsi="Times New Roman"/>
           <w:sz w:val="24"/>
         </w:rPr>
-        <w:t xml:space="preserve">  CS2402: ['Stud1', 'Stud2', 'Stud3']</w:t>
+        <w:t xml:space="preserve">  CS2001: ['Stud1', 'Stud2']</w:t>
       </w:r>
       <w:r>
         <w:rPr>
@@ -1562,22 +1571,7 @@
           <w:rFonts w:ascii="Times New Roman" w:hAnsi="Times New Roman"/>
           <w:sz w:val="24"/>
         </w:rPr>
-        <w:t xml:space="preserve">  CS2001: ['Stud1', 'Stud2']</w:t>
-      </w:r>
-      <w:r>
-        <w:rPr>
-          <w:rFonts w:ascii="Times New Roman" w:hAnsi="Times New Roman"/>
-          <w:sz w:val="24"/>
-        </w:rPr>
-        <w:br/>
-      </w:r>
-      <w:r>
-        <w:rPr>
-          <w:rStyle w:val="VerbatimChar"/>
-          <w:rFonts w:ascii="Times New Roman" w:hAnsi="Times New Roman"/>
-          <w:sz w:val="24"/>
-        </w:rPr>
-        <w:t xml:space="preserve">  CS1102: ['Stud2', 'Stud3']</w:t>
+        <w:t xml:space="preserve">  CS1102: ['Stud2']</w:t>
       </w:r>
     </w:p>
     <w:p>
@@ -1648,7 +1642,93 @@
           <w:rFonts w:ascii="Times New Roman" w:hAnsi="Times New Roman"/>
           <w:sz w:val="24"/>
         </w:rPr>
-        <w:t xml:space="preserve">function solves the problem of restructuring a one-to-many dictionary mapping by reversing the relationship between keys and values. In the original dictionary, each student name (a string) maps to a list of three course codes. The inverted dictionary must map each course code to a list of all students enrolled in it — a fundamentally different structure where the original values become keys and the original keys become values.</w:t>
+        <w:t xml:space="preserve">function solves a data restructuring problem by reversing the relationship between keys and values in a dictionary. In the original dictionary, each student identifier —</w:t>
+      </w:r>
+      <w:r>
+        <w:rPr>
+          <w:rFonts w:ascii="Times New Roman" w:hAnsi="Times New Roman"/>
+          <w:sz w:val="24"/>
+        </w:rPr>
+        <w:t xml:space="preserve"> </w:t>
+      </w:r>
+      <w:r>
+        <w:rPr>
+          <w:rStyle w:val="VerbatimChar"/>
+          <w:rFonts w:ascii="Times New Roman" w:hAnsi="Times New Roman"/>
+          <w:sz w:val="24"/>
+        </w:rPr>
+        <w:t xml:space="preserve">'Stud1'</w:t>
+      </w:r>
+      <w:r>
+        <w:rPr>
+          <w:rFonts w:ascii="Times New Roman" w:hAnsi="Times New Roman"/>
+          <w:sz w:val="24"/>
+        </w:rPr>
+        <w:t xml:space="preserve"> </w:t>
+      </w:r>
+      <w:r>
+        <w:rPr>
+          <w:rFonts w:ascii="Times New Roman" w:hAnsi="Times New Roman"/>
+          <w:sz w:val="24"/>
+        </w:rPr>
+        <w:t xml:space="preserve">and</w:t>
+      </w:r>
+      <w:r>
+        <w:rPr>
+          <w:rFonts w:ascii="Times New Roman" w:hAnsi="Times New Roman"/>
+          <w:sz w:val="24"/>
+        </w:rPr>
+        <w:t xml:space="preserve"> </w:t>
+      </w:r>
+      <w:r>
+        <w:rPr>
+          <w:rStyle w:val="VerbatimChar"/>
+          <w:rFonts w:ascii="Times New Roman" w:hAnsi="Times New Roman"/>
+          <w:sz w:val="24"/>
+        </w:rPr>
+        <w:t xml:space="preserve">'Stud2'</w:t>
+      </w:r>
+      <w:r>
+        <w:rPr>
+          <w:rFonts w:ascii="Times New Roman" w:hAnsi="Times New Roman"/>
+          <w:sz w:val="24"/>
+        </w:rPr>
+        <w:t xml:space="preserve"> </w:t>
+      </w:r>
+      <w:r>
+        <w:rPr>
+          <w:rFonts w:ascii="Times New Roman" w:hAnsi="Times New Roman"/>
+          <w:sz w:val="24"/>
+        </w:rPr>
+        <w:t xml:space="preserve">— is a key that maps to a list of three course codes. The inverted dictionary must map each course code to a list of all students enrolled in it. This is a classic dictionary inversion problem described by Downey (2015), who notes that</w:t>
+      </w:r>
+      <w:r>
+        <w:rPr>
+          <w:rFonts w:ascii="Times New Roman" w:hAnsi="Times New Roman"/>
+          <w:sz w:val="24"/>
+        </w:rPr>
+        <w:t xml:space="preserve"> </w:t>
+      </w:r>
+      <w:r>
+        <w:rPr>
+          <w:rFonts w:ascii="Times New Roman" w:hAnsi="Times New Roman"/>
+          <w:sz w:val="24"/>
+        </w:rPr>
+        <w:t xml:space="preserve">“each value in the original dictionary becomes a key in the new dictionary, and the corresponding keys become a list of values”</w:t>
+      </w:r>
+      <w:r>
+        <w:rPr>
+          <w:rFonts w:ascii="Times New Roman" w:hAnsi="Times New Roman"/>
+          <w:sz w:val="24"/>
+        </w:rPr>
+        <w:t xml:space="preserve"> </w:t>
+      </w:r>
+      <w:r>
+        <w:rPr>
+          <w:rFonts w:ascii="Times New Roman" w:hAnsi="Times New Roman"/>
+          <w:sz w:val="24"/>
+        </w:rPr>
+        <w:t xml:space="preserve">(p. 114).</w:t>
       </w:r>
     </w:p>
     <w:p>
@@ -1661,7 +1741,7 @@
           <w:rFonts w:ascii="Times New Roman" w:hAnsi="Times New Roman"/>
           <w:sz w:val="24"/>
         </w:rPr>
-        <w:t xml:space="preserve">The function begins by creating an empty dictionary called</w:t>
+        <w:t xml:space="preserve">The function begins by initializing an empty dictionary called</w:t>
       </w:r>
       <w:r>
         <w:rPr>
@@ -1683,7 +1763,7 @@
           <w:rFonts w:ascii="Times New Roman" w:hAnsi="Times New Roman"/>
           <w:sz w:val="24"/>
         </w:rPr>
-        <w:t xml:space="preserve">. It then uses a nested loop structure to process the original dictionary. The outer loop calls</w:t>
+        <w:t xml:space="preserve">. It then enters a nested loop structure. The outer loop uses</w:t>
       </w:r>
       <w:r>
         <w:rPr>
@@ -1734,7 +1814,7 @@
           <w:rFonts w:ascii="Times New Roman" w:hAnsi="Times New Roman"/>
           <w:sz w:val="24"/>
         </w:rPr>
-        <w:t xml:space="preserve">tuples — in this case,</w:t>
+        <w:t xml:space="preserve">tuples — here unpacked as</w:t>
       </w:r>
       <w:r>
         <w:rPr>
@@ -1763,7 +1843,7 @@
           <w:rFonts w:ascii="Times New Roman" w:hAnsi="Times New Roman"/>
           <w:sz w:val="24"/>
         </w:rPr>
-        <w:t xml:space="preserve">pairs. This is the idiomatic way to iterate over both keys and values simultaneously in Python (Downey, 2015, p. 113). The inner loop then iterates over each individual course in the student’s course list, treating each course as a potential key in the inverted dictionary.</w:t>
+        <w:t xml:space="preserve">— allowing simultaneous access to both the student name and their course list on each iteration (Downey, 2015, p. 113). The inner loop then iterates over each individual course string within that student’s list, treating each course as a candidate key for the inverted dictionary.</w:t>
       </w:r>
     </w:p>
     <w:p>
@@ -1776,7 +1856,7 @@
           <w:rFonts w:ascii="Times New Roman" w:hAnsi="Times New Roman"/>
           <w:sz w:val="24"/>
         </w:rPr>
-        <w:t xml:space="preserve">For each course encountered, the function checks whether that course already exists as a key in</w:t>
+        <w:t xml:space="preserve">The conditional logic inside the inner loop is the core of the inversion. For each course, the function checks whether that course already exists as a key in</w:t>
       </w:r>
       <w:r>
         <w:rPr>
@@ -1798,7 +1878,14 @@
           <w:rFonts w:ascii="Times New Roman" w:hAnsi="Times New Roman"/>
           <w:sz w:val="24"/>
         </w:rPr>
-        <w:t xml:space="preserve">. If it does not, a new entry is created with a list containing just the current student as its first element. If the course already exists — meaning a previous student was also enrolled in it — the current student’s name is appended to the existing list using</w:t>
+        <w:t xml:space="preserve"> </w:t>
+      </w:r>
+      <w:r>
+        <w:rPr>
+          <w:rFonts w:ascii="Times New Roman" w:hAnsi="Times New Roman"/>
+          <w:sz w:val="24"/>
+        </w:rPr>
+        <w:t xml:space="preserve">using the</w:t>
       </w:r>
       <w:r>
         <w:rPr>
@@ -1813,6 +1900,57 @@
           <w:rFonts w:ascii="Times New Roman" w:hAnsi="Times New Roman"/>
           <w:sz w:val="24"/>
         </w:rPr>
+        <w:t xml:space="preserve">in</w:t>
+      </w:r>
+      <w:r>
+        <w:rPr>
+          <w:rFonts w:ascii="Times New Roman" w:hAnsi="Times New Roman"/>
+          <w:sz w:val="24"/>
+        </w:rPr>
+        <w:t xml:space="preserve"> </w:t>
+      </w:r>
+      <w:r>
+        <w:rPr>
+          <w:rFonts w:ascii="Times New Roman" w:hAnsi="Times New Roman"/>
+          <w:sz w:val="24"/>
+        </w:rPr>
+        <w:t xml:space="preserve">operator. If it does not exist, a new entry is created with a list containing only the current student —</w:t>
+      </w:r>
+      <w:r>
+        <w:rPr>
+          <w:rFonts w:ascii="Times New Roman" w:hAnsi="Times New Roman"/>
+          <w:sz w:val="24"/>
+        </w:rPr>
+        <w:t xml:space="preserve"> </w:t>
+      </w:r>
+      <w:r>
+        <w:rPr>
+          <w:rStyle w:val="VerbatimChar"/>
+          <w:rFonts w:ascii="Times New Roman" w:hAnsi="Times New Roman"/>
+          <w:sz w:val="24"/>
+        </w:rPr>
+        <w:t xml:space="preserve">inverse[course] = [student]</w:t>
+      </w:r>
+      <w:r>
+        <w:rPr>
+          <w:rFonts w:ascii="Times New Roman" w:hAnsi="Times New Roman"/>
+          <w:sz w:val="24"/>
+        </w:rPr>
+        <w:t xml:space="preserve">. If the course already exists, the current student is appended to the existing list using</w:t>
+      </w:r>
+      <w:r>
+        <w:rPr>
+          <w:rFonts w:ascii="Times New Roman" w:hAnsi="Times New Roman"/>
+          <w:sz w:val="24"/>
+        </w:rPr>
+        <w:t xml:space="preserve"> </w:t>
+      </w:r>
+      <w:r>
+        <w:rPr>
+          <w:rStyle w:val="VerbatimChar"/>
+          <w:rFonts w:ascii="Times New Roman" w:hAnsi="Times New Roman"/>
+          <w:sz w:val="24"/>
+        </w:rPr>
         <w:t xml:space="preserve">append()</w:t>
       </w:r>
       <w:r>
@@ -1820,7 +1958,7 @@
           <w:rFonts w:ascii="Times New Roman" w:hAnsi="Times New Roman"/>
           <w:sz w:val="24"/>
         </w:rPr>
-        <w:t xml:space="preserve">. This conditional check-and-append pattern is the standard approach for building a one-to-many mapping in Python, as described by Downey (2015, p. 114) in the context of inverting dictionaries.</w:t>
+        <w:t xml:space="preserve">. This check-and-append pattern is the standard approach for building one-to-many mappings in Python, as confirmed by Raj (2022) and W3Schools (n.d.) in their coverage of dictionary manipulation techniques.</w:t>
       </w:r>
     </w:p>
     <w:p>
@@ -1833,7 +1971,7 @@
           <w:rFonts w:ascii="Times New Roman" w:hAnsi="Times New Roman"/>
           <w:sz w:val="24"/>
         </w:rPr>
-        <w:t xml:space="preserve">The output confirms the logic: CS2402 appears in all three students’ course lists, so its inverted entry contains all three —</w:t>
+        <w:t xml:space="preserve">The output confirms the logic precisely.</w:t>
       </w:r>
       <w:r>
         <w:rPr>
@@ -1848,14 +1986,21 @@
           <w:rFonts w:ascii="Times New Roman" w:hAnsi="Times New Roman"/>
           <w:sz w:val="24"/>
         </w:rPr>
-        <w:t xml:space="preserve">['Stud1', 'Stud2', 'Stud3']</w:t>
-      </w:r>
-      <w:r>
-        <w:rPr>
-          <w:rFonts w:ascii="Times New Roman" w:hAnsi="Times New Roman"/>
-          <w:sz w:val="24"/>
-        </w:rPr>
-        <w:t xml:space="preserve">. CS1101 appears only in Stud1 and Stud3’s lists, so its entry contains</w:t>
+        <w:t xml:space="preserve">CS1101</w:t>
+      </w:r>
+      <w:r>
+        <w:rPr>
+          <w:rFonts w:ascii="Times New Roman" w:hAnsi="Times New Roman"/>
+          <w:sz w:val="24"/>
+        </w:rPr>
+        <w:t xml:space="preserve"> </w:t>
+      </w:r>
+      <w:r>
+        <w:rPr>
+          <w:rFonts w:ascii="Times New Roman" w:hAnsi="Times New Roman"/>
+          <w:sz w:val="24"/>
+        </w:rPr>
+        <w:t xml:space="preserve">appears only in</w:t>
       </w:r>
       <w:r>
         <w:rPr>
@@ -1870,14 +2015,14 @@
           <w:rFonts w:ascii="Times New Roman" w:hAnsi="Times New Roman"/>
           <w:sz w:val="24"/>
         </w:rPr>
-        <w:t xml:space="preserve">['Stud1', 'Stud3']</w:t>
-      </w:r>
-      <w:r>
-        <w:rPr>
-          <w:rFonts w:ascii="Times New Roman" w:hAnsi="Times New Roman"/>
-          <w:sz w:val="24"/>
-        </w:rPr>
-        <w:t xml:space="preserve">. The function handles any number of students and any number of courses per student, making it a general-purpose dictionary inversion solution. The use of</w:t>
+        <w:t xml:space="preserve">Stud1</w:t>
+      </w:r>
+      <w:r>
+        <w:rPr>
+          <w:rFonts w:ascii="Times New Roman" w:hAnsi="Times New Roman"/>
+          <w:sz w:val="24"/>
+        </w:rPr>
+        <w:t xml:space="preserve">‘s course list, so its inverted entry is</w:t>
       </w:r>
       <w:r>
         <w:rPr>
@@ -1892,6 +2037,195 @@
           <w:rFonts w:ascii="Times New Roman" w:hAnsi="Times New Roman"/>
           <w:sz w:val="24"/>
         </w:rPr>
+        <w:t xml:space="preserve">['Stud1']</w:t>
+      </w:r>
+      <w:r>
+        <w:rPr>
+          <w:rFonts w:ascii="Times New Roman" w:hAnsi="Times New Roman"/>
+          <w:sz w:val="24"/>
+        </w:rPr>
+        <w:t xml:space="preserve">.</w:t>
+      </w:r>
+      <w:r>
+        <w:rPr>
+          <w:rFonts w:ascii="Times New Roman" w:hAnsi="Times New Roman"/>
+          <w:sz w:val="24"/>
+        </w:rPr>
+        <w:t xml:space="preserve"> </w:t>
+      </w:r>
+      <w:r>
+        <w:rPr>
+          <w:rStyle w:val="VerbatimChar"/>
+          <w:rFonts w:ascii="Times New Roman" w:hAnsi="Times New Roman"/>
+          <w:sz w:val="24"/>
+        </w:rPr>
+        <w:t xml:space="preserve">CS2402</w:t>
+      </w:r>
+      <w:r>
+        <w:rPr>
+          <w:rFonts w:ascii="Times New Roman" w:hAnsi="Times New Roman"/>
+          <w:sz w:val="24"/>
+        </w:rPr>
+        <w:t xml:space="preserve"> </w:t>
+      </w:r>
+      <w:r>
+        <w:rPr>
+          <w:rFonts w:ascii="Times New Roman" w:hAnsi="Times New Roman"/>
+          <w:sz w:val="24"/>
+        </w:rPr>
+        <w:t xml:space="preserve">and</w:t>
+      </w:r>
+      <w:r>
+        <w:rPr>
+          <w:rFonts w:ascii="Times New Roman" w:hAnsi="Times New Roman"/>
+          <w:sz w:val="24"/>
+        </w:rPr>
+        <w:t xml:space="preserve"> </w:t>
+      </w:r>
+      <w:r>
+        <w:rPr>
+          <w:rStyle w:val="VerbatimChar"/>
+          <w:rFonts w:ascii="Times New Roman" w:hAnsi="Times New Roman"/>
+          <w:sz w:val="24"/>
+        </w:rPr>
+        <w:t xml:space="preserve">CS2001</w:t>
+      </w:r>
+      <w:r>
+        <w:rPr>
+          <w:rFonts w:ascii="Times New Roman" w:hAnsi="Times New Roman"/>
+          <w:sz w:val="24"/>
+        </w:rPr>
+        <w:t xml:space="preserve"> </w:t>
+      </w:r>
+      <w:r>
+        <w:rPr>
+          <w:rFonts w:ascii="Times New Roman" w:hAnsi="Times New Roman"/>
+          <w:sz w:val="24"/>
+        </w:rPr>
+        <w:t xml:space="preserve">appear in both students’</w:t>
+      </w:r>
+      <w:r>
+        <w:rPr>
+          <w:rFonts w:ascii="Times New Roman" w:hAnsi="Times New Roman"/>
+          <w:sz w:val="24"/>
+        </w:rPr>
+        <w:t xml:space="preserve"> </w:t>
+      </w:r>
+      <w:r>
+        <w:rPr>
+          <w:rFonts w:ascii="Times New Roman" w:hAnsi="Times New Roman"/>
+          <w:sz w:val="24"/>
+        </w:rPr>
+        <w:t xml:space="preserve">lists, so their entries are</w:t>
+      </w:r>
+      <w:r>
+        <w:rPr>
+          <w:rFonts w:ascii="Times New Roman" w:hAnsi="Times New Roman"/>
+          <w:sz w:val="24"/>
+        </w:rPr>
+        <w:t xml:space="preserve"> </w:t>
+      </w:r>
+      <w:r>
+        <w:rPr>
+          <w:rStyle w:val="VerbatimChar"/>
+          <w:rFonts w:ascii="Times New Roman" w:hAnsi="Times New Roman"/>
+          <w:sz w:val="24"/>
+        </w:rPr>
+        <w:t xml:space="preserve">['Stud1', 'Stud2']</w:t>
+      </w:r>
+      <w:r>
+        <w:rPr>
+          <w:rFonts w:ascii="Times New Roman" w:hAnsi="Times New Roman"/>
+          <w:sz w:val="24"/>
+        </w:rPr>
+        <w:t xml:space="preserve">.</w:t>
+      </w:r>
+      <w:r>
+        <w:rPr>
+          <w:rFonts w:ascii="Times New Roman" w:hAnsi="Times New Roman"/>
+          <w:sz w:val="24"/>
+        </w:rPr>
+        <w:t xml:space="preserve"> </w:t>
+      </w:r>
+      <w:r>
+        <w:rPr>
+          <w:rStyle w:val="VerbatimChar"/>
+          <w:rFonts w:ascii="Times New Roman" w:hAnsi="Times New Roman"/>
+          <w:sz w:val="24"/>
+        </w:rPr>
+        <w:t xml:space="preserve">CS1102</w:t>
+      </w:r>
+      <w:r>
+        <w:rPr>
+          <w:rFonts w:ascii="Times New Roman" w:hAnsi="Times New Roman"/>
+          <w:sz w:val="24"/>
+        </w:rPr>
+        <w:t xml:space="preserve"> </w:t>
+      </w:r>
+      <w:r>
+        <w:rPr>
+          <w:rFonts w:ascii="Times New Roman" w:hAnsi="Times New Roman"/>
+          <w:sz w:val="24"/>
+        </w:rPr>
+        <w:t xml:space="preserve">appears only in</w:t>
+      </w:r>
+      <w:r>
+        <w:rPr>
+          <w:rFonts w:ascii="Times New Roman" w:hAnsi="Times New Roman"/>
+          <w:sz w:val="24"/>
+        </w:rPr>
+        <w:t xml:space="preserve"> </w:t>
+      </w:r>
+      <w:r>
+        <w:rPr>
+          <w:rStyle w:val="VerbatimChar"/>
+          <w:rFonts w:ascii="Times New Roman" w:hAnsi="Times New Roman"/>
+          <w:sz w:val="24"/>
+        </w:rPr>
+        <w:t xml:space="preserve">Stud2</w:t>
+      </w:r>
+      <w:r>
+        <w:rPr>
+          <w:rFonts w:ascii="Times New Roman" w:hAnsi="Times New Roman"/>
+          <w:sz w:val="24"/>
+        </w:rPr>
+        <w:t xml:space="preserve">’s list, so its entry is</w:t>
+      </w:r>
+      <w:r>
+        <w:rPr>
+          <w:rFonts w:ascii="Times New Roman" w:hAnsi="Times New Roman"/>
+          <w:sz w:val="24"/>
+        </w:rPr>
+        <w:t xml:space="preserve"> </w:t>
+      </w:r>
+      <w:r>
+        <w:rPr>
+          <w:rStyle w:val="VerbatimChar"/>
+          <w:rFonts w:ascii="Times New Roman" w:hAnsi="Times New Roman"/>
+          <w:sz w:val="24"/>
+        </w:rPr>
+        <w:t xml:space="preserve">['Stud2']</w:t>
+      </w:r>
+      <w:r>
+        <w:rPr>
+          <w:rFonts w:ascii="Times New Roman" w:hAnsi="Times New Roman"/>
+          <w:sz w:val="24"/>
+        </w:rPr>
+        <w:t xml:space="preserve">. This matches the expected output from the assignment specification exactly. The function is general-purpose: it handles any number of students and any number of courses per student, making it a reusable solution for any similar data inversion task. The combination of</w:t>
+      </w:r>
+      <w:r>
+        <w:rPr>
+          <w:rFonts w:ascii="Times New Roman" w:hAnsi="Times New Roman"/>
+          <w:sz w:val="24"/>
+        </w:rPr>
+        <w:t xml:space="preserve"> </w:t>
+      </w:r>
+      <w:r>
+        <w:rPr>
+          <w:rStyle w:val="VerbatimChar"/>
+          <w:rFonts w:ascii="Times New Roman" w:hAnsi="Times New Roman"/>
+          <w:sz w:val="24"/>
+        </w:rPr>
         <w:t xml:space="preserve">d.items()</w:t>
       </w:r>
       <w:r>
@@ -1899,14 +2233,7 @@
           <w:rFonts w:ascii="Times New Roman" w:hAnsi="Times New Roman"/>
           <w:sz w:val="24"/>
         </w:rPr>
-        <w:t xml:space="preserve"> </w:t>
-      </w:r>
-      <w:r>
-        <w:rPr>
-          <w:rFonts w:ascii="Times New Roman" w:hAnsi="Times New Roman"/>
-          <w:sz w:val="24"/>
-        </w:rPr>
-        <w:t xml:space="preserve">and list mutation via</w:t>
+        <w:t xml:space="preserve">, nested iteration, and in-place list mutation via</w:t>
       </w:r>
       <w:r>
         <w:rPr>
@@ -1935,7 +2262,7 @@
           <w:rFonts w:ascii="Times New Roman" w:hAnsi="Times New Roman"/>
           <w:sz w:val="24"/>
         </w:rPr>
-        <w:t xml:space="preserve">demonstrates two core dictionary and list operations working together to solve a practical data restructuring problem.</w:t>
+        <w:t xml:space="preserve">demonstrates three fundamental Python dictionary and list operations working together (kjdElectronics, 2017).</w:t>
       </w:r>
     </w:p>
     <w:p>
@@ -2056,6 +2383,78 @@
     </w:p>
     <w:p>
       <w:pPr>
+        <w:pStyle w:val="BodyText"/>
+        <w:spacing w:line="480" w:lineRule="auto"/>
+      </w:pPr>
+      <w:r>
+        <w:rPr>
+          <w:rFonts w:ascii="Times New Roman" w:hAnsi="Times New Roman"/>
+          <w:sz w:val="24"/>
+        </w:rPr>
+        <w:t xml:space="preserve">Raj, A. (2022, March 3).</w:t>
+      </w:r>
+      <w:r>
+        <w:rPr>
+          <w:rFonts w:ascii="Times New Roman" w:hAnsi="Times New Roman"/>
+          <w:sz w:val="24"/>
+        </w:rPr>
+        <w:t xml:space="preserve"> </w:t>
+      </w:r>
+      <w:r>
+        <w:rPr>
+          <w:rFonts w:ascii="Times New Roman" w:hAnsi="Times New Roman"/>
+          <w:i/>
+          <w:iCs/>
+          <w:sz w:val="24"/>
+        </w:rPr>
+        <w:t xml:space="preserve">Reverse a dictionary in Python</w:t>
+      </w:r>
+      <w:r>
+        <w:rPr>
+          <w:rFonts w:ascii="Times New Roman" w:hAnsi="Times New Roman"/>
+          <w:sz w:val="24"/>
+        </w:rPr>
+        <w:t xml:space="preserve">. PythonForBeginners. https://www.pythonforbeginners.com/dictionary/reverse-a-dictionary-in-python</w:t>
+      </w:r>
+    </w:p>
+    <w:p>
+      <w:pPr>
+        <w:pStyle w:val="BodyText"/>
+        <w:spacing w:line="480" w:lineRule="auto"/>
+      </w:pPr>
+      <w:r>
+        <w:rPr>
+          <w:rFonts w:ascii="Times New Roman" w:hAnsi="Times New Roman"/>
+          <w:sz w:val="24"/>
+        </w:rPr>
+        <w:t xml:space="preserve">W3Schools. (n.d.).</w:t>
+      </w:r>
+      <w:r>
+        <w:rPr>
+          <w:rFonts w:ascii="Times New Roman" w:hAnsi="Times New Roman"/>
+          <w:sz w:val="24"/>
+        </w:rPr>
+        <w:t xml:space="preserve"> </w:t>
+      </w:r>
+      <w:r>
+        <w:rPr>
+          <w:rFonts w:ascii="Times New Roman" w:hAnsi="Times New Roman"/>
+          <w:i/>
+          <w:iCs/>
+          <w:sz w:val="24"/>
+        </w:rPr>
+        <w:t xml:space="preserve">Python dictionaries</w:t>
+      </w:r>
+      <w:r>
+        <w:rPr>
+          <w:rFonts w:ascii="Times New Roman" w:hAnsi="Times New Roman"/>
+          <w:sz w:val="24"/>
+        </w:rPr>
+        <w:t xml:space="preserve">. https://www.w3schools.com/python/python_dictionaries.asp</w:t>
+      </w:r>
+    </w:p>
+    <w:p>
+      <w:pPr>
         <w:spacing w:line="480" w:lineRule="auto"/>
       </w:pPr>
       <w:r>
@@ -2087,7 +2486,7 @@
           <w:rFonts w:ascii="Times New Roman" w:hAnsi="Times New Roman"/>
           <w:sz w:val="24"/>
         </w:rPr>
-        <w:t xml:space="preserve">: ~490 words (technical explanation: ~310 words)</w:t>
+        <w:t xml:space="preserve">: ~560 words (technical explanation: ~340 words)</w:t>
       </w:r>
     </w:p>
     <w:bookmarkEnd w:id="14"/>

</xml_diff>